<commit_message>
Adding unnecessary files to gitignore
</commit_message>
<xml_diff>
--- a/App Dev Project Report.docx
+++ b/App Dev Project Report.docx
@@ -137,7 +137,7 @@
         <w:rPr>
           <w:rtl w:val="0"/>
         </w:rPr>
-        <w:t xml:space="preserve">I am a Student Enrolled in IIT Madras BS Degree program with a deep interest in      data science, AI and low low level systems design. I enjoy building applications and coding.</w:t>
+        <w:t xml:space="preserve">I am a Student Enrolled in IIT Madras BS Degree program with a deep interest in      data science, AI and low low level systems design. I enjoy building applications and solving coding challenges.</w:t>
       </w:r>
     </w:p>
     <w:p>
@@ -251,7 +251,7 @@
         <w:rPr>
           <w:rtl w:val="0"/>
         </w:rPr>
-        <w:t xml:space="preserve">To design and build a web-based application that allows users to interact with it based on their role</w:t>
+        <w:t xml:space="preserve">To design and build a web-based application that allows users to interact with it based on their role, It allows users to browse and book treks and view trekking history, staff to manage and view treks and participants and admin to perform CRUD operation on treks in database, control staff-member access, block /  accept users and staff, view bookings.</w:t>
       </w:r>
     </w:p>
     <w:p>
@@ -293,7 +293,7 @@
         <w:rPr>
           <w:rtl w:val="0"/>
         </w:rPr>
-        <w:t xml:space="preserve">The app was built using Flask as the backend framework with a modular structure. It allows users to interact with it depending on their role</w:t>
+        <w:t xml:space="preserve">The app was built using Flask as the backend framework with a modular structure. SQLite for database and FlaskSQLAlchemy to interact with the database, </w:t>
       </w:r>
     </w:p>
     <w:p>
@@ -357,7 +357,7 @@
           <w:bCs w:val="1"/>
           <w:rtl w:val="0"/>
         </w:rPr>
-        <w:t xml:space="preserve">Claude (Sonnet-4.6) and Google Gemini </w:t>
+        <w:t xml:space="preserve">Claude (Sonnet-5) and Google Gemini </w:t>
       </w:r>
       <w:r>
         <w:rPr>
@@ -387,14 +387,13 @@
           <w:bCs w:val="1"/>
           <w:rtl w:val="0"/>
         </w:rPr>
-        <w:t xml:space="preserve">code suggestions and ui design</w:t>
-      </w:r>
-      <w:r>
-        <w:rPr>
-          <w:rtl w:val="0"/>
-        </w:rPr>
-        <w:br w:type="textWrapping"/>
-        <w:t xml:space="preserve"> All final implementation logic, debugging, and integration were done by me</w:t>
+        <w:t xml:space="preserve">code and styling suggestions, generic advice and debugging help. </w:t>
+      </w:r>
+      <w:r>
+        <w:rPr>
+          <w:rtl w:val="0"/>
+        </w:rPr>
+        <w:t xml:space="preserve">All final implementation logic, and integration were done by me</w:t>
       </w:r>
     </w:p>
     <w:p>
@@ -458,12 +457,12 @@
         <w:tblLook w:val="0600"/>
       </w:tblPr>
       <w:tblGrid>
-        <w:gridCol w:w="2205"/>
-        <w:gridCol w:w="5355"/>
+        <w:gridCol w:w="2370"/>
+        <w:gridCol w:w="5190"/>
         <w:tblGridChange w:id="0">
           <w:tblGrid>
-            <w:gridCol w:w="2205"/>
-            <w:gridCol w:w="5355"/>
+            <w:gridCol w:w="2370"/>
+            <w:gridCol w:w="5190"/>
           </w:tblGrid>
         </w:tblGridChange>
       </w:tblGrid>
@@ -651,7 +650,7 @@
                 <w:bCs w:val="1"/>
                 <w:rtl w:val="0"/>
               </w:rPr>
-              <w:t xml:space="preserve">SQLAlchemy</w:t>
+              <w:t xml:space="preserve">FlaskSQLAlchemy</w:t>
             </w:r>
             <w:r>
               <w:rPr>

</xml_diff>